<commit_message>
C: fields.yaml 补 5 缺失勾选键 — I-1 修复(property_has_has/debt_has_has/agent_has_no/e_service_no/e_service_method_other)+ template 重生成 + 测试断言扩容
</commit_message>
<xml_diff>
--- a/data/doc_templates/complaint/template.docx
+++ b/data/doc_templates/complaint/template.docx
@@ -570,16 +570,7 @@
                 <w:sz w:val="18"/>
                 <w:szCs w:val="18"/>
               </w:rPr>
-              <w:t>{{ c.agent_has_yes }}有</w:t>
-            </w:r>
-            <w:r>
-              <w:rPr>
-                <w:rFonts w:hint="eastAsia" w:ascii="宋体" w:hAnsi="宋体"/>
-                <w:color w:val="000000"/>
-                <w:sz w:val="18"/>
-                <w:szCs w:val="18"/>
-              </w:rPr>
-              <w:sym w:font="Wingdings 2" w:char="00A3"/>
+              <w:t xml:space="preserve">{{ c.agent_has_yes }}有</w:t>
             </w:r>
           </w:p>
           <w:p>
@@ -661,16 +652,7 @@
                 <w:sz w:val="18"/>
                 <w:szCs w:val="18"/>
               </w:rPr>
-              <w:t>无</w:t>
-            </w:r>
-            <w:r>
-              <w:rPr>
-                <w:rFonts w:hint="eastAsia" w:ascii="宋体" w:hAnsi="宋体"/>
-                <w:color w:val="000000"/>
-                <w:sz w:val="18"/>
-                <w:szCs w:val="18"/>
-              </w:rPr>
-              <w:sym w:font="Wingdings 2" w:char="00A3"/>
+              <w:t xml:space="preserve">{{ c.agent_has_no }}无</w:t>
             </w:r>
           </w:p>
         </w:tc>
@@ -888,17 +870,7 @@
                 <w:sz w:val="18"/>
                 <w:szCs w:val="18"/>
               </w:rPr>
-              <w:t xml:space="preserve"> 其他</w:t>
-            </w:r>
-            <w:r>
-              <w:rPr>
-                <w:rFonts w:hint="eastAsia" w:ascii="宋体" w:hAnsi="宋体"/>
-                <w:color w:val="000000"/>
-                <w:sz w:val="18"/>
-                <w:szCs w:val="18"/>
-                <w:u w:val="single"/>
-              </w:rPr>
-              <w:t xml:space="preserve">         </w:t>
+              <w:t xml:space="preserve">{{ c.e_service_method_other }}其他</w:t>
             </w:r>
           </w:p>
           <w:p>
@@ -920,16 +892,7 @@
                 <w:sz w:val="18"/>
                 <w:szCs w:val="18"/>
               </w:rPr>
-              <w:t>否</w:t>
-            </w:r>
-            <w:r>
-              <w:rPr>
-                <w:rFonts w:hint="eastAsia" w:ascii="宋体" w:hAnsi="宋体"/>
-                <w:color w:val="000000"/>
-                <w:sz w:val="18"/>
-                <w:szCs w:val="18"/>
-              </w:rPr>
-              <w:sym w:font="Wingdings 2" w:char="00A3"/>
+              <w:t xml:space="preserve">{{ c.e_service_no }}否</w:t>
             </w:r>
           </w:p>
         </w:tc>
@@ -1347,25 +1310,7 @@
                 <w:sz w:val="18"/>
                 <w:szCs w:val="18"/>
               </w:rPr>
-              <w:t>有财产</w:t>
-            </w:r>
-            <w:r>
-              <w:rPr>
-                <w:rFonts w:hint="eastAsia" w:ascii="宋体" w:hAnsi="宋体"/>
-                <w:color w:val="000000"/>
-                <w:sz w:val="18"/>
-                <w:szCs w:val="18"/>
-              </w:rPr>
-              <w:sym w:font="Wingdings 2" w:char="00A3"/>
-            </w:r>
-            <w:r>
-              <w:rPr>
-                <w:rFonts w:hint="eastAsia" w:ascii="宋体" w:hAnsi="宋体"/>
-                <w:color w:val="000000"/>
-                <w:sz w:val="18"/>
-                <w:szCs w:val="18"/>
-              </w:rPr>
-              <w:t>：</w:t>
+              <w:t xml:space="preserve">{{ c.property_has_has }}有财产：</w:t>
             </w:r>
           </w:p>
           <w:p>
@@ -1554,16 +1499,7 @@
                 <w:sz w:val="18"/>
                 <w:szCs w:val="18"/>
               </w:rPr>
-              <w:t>有债务</w:t>
-            </w:r>
-            <w:r>
-              <w:rPr>
-                <w:rFonts w:hint="eastAsia" w:ascii="宋体" w:hAnsi="宋体"/>
-                <w:color w:val="000000"/>
-                <w:sz w:val="18"/>
-                <w:szCs w:val="18"/>
-              </w:rPr>
-              <w:sym w:font="Wingdings 2" w:char="00A3"/>
+              <w:t xml:space="preserve">{{ c.debt_has_has }}有债务</w:t>
             </w:r>
           </w:p>
           <w:p>

</xml_diff>